<commit_message>
Changed to Local LLM
</commit_message>
<xml_diff>
--- a/tool/templates/Final Template.docx
+++ b/tool/templates/Final Template.docx
@@ -214,15 +214,16 @@
           <w:b/>
           <w:bCs/>
         </w:rPr>
-        <w:t xml:space="preserve">  {</w:t>
-      </w:r>
+        <w:t xml:space="preserve">  </w:t>
+      </w:r>
+      <w:proofErr w:type="gramStart"/>
       <w:r>
         <w:rPr>
           <w:rFonts w:asciiTheme="majorHAnsi" w:eastAsia="Montserrat" w:hAnsiTheme="majorHAnsi" w:cstheme="majorHAnsi"/>
           <w:b/>
           <w:bCs/>
         </w:rPr>
-        <w:t>{ name }}</w:t>
+        <w:t>{</w:t>
       </w:r>
       <w:r>
         <w:rPr>
@@ -230,149 +231,29 @@
           <w:b/>
           <w:bCs/>
         </w:rPr>
+        <w:t>{ name</w:t>
+      </w:r>
+      <w:proofErr w:type="gramEnd"/>
+      <w:r>
+        <w:rPr>
+          <w:rFonts w:asciiTheme="majorHAnsi" w:eastAsia="Montserrat" w:hAnsiTheme="majorHAnsi" w:cstheme="majorHAnsi"/>
+          <w:b/>
+          <w:bCs/>
+        </w:rPr>
+        <w:t xml:space="preserve"> }}</w:t>
+      </w:r>
+      <w:r>
+        <w:rPr>
+          <w:rFonts w:asciiTheme="majorHAnsi" w:eastAsia="Montserrat" w:hAnsiTheme="majorHAnsi" w:cstheme="majorHAnsi"/>
+          <w:b/>
+          <w:bCs/>
+        </w:rPr>
         <w:t xml:space="preserve">                                                                                     </w:t>
       </w:r>
     </w:p>
     <w:p>
       <w:pPr>
         <w:spacing w:line="276" w:lineRule="auto"/>
-        <w:jc w:val="center"/>
-        <w:rPr>
-          <w:rFonts w:asciiTheme="majorHAnsi" w:eastAsia="Montserrat" w:hAnsiTheme="majorHAnsi" w:cstheme="majorHAnsi"/>
-          <w:b/>
-          <w:bCs/>
-          <w:sz w:val="20"/>
-          <w:szCs w:val="20"/>
-        </w:rPr>
-      </w:pPr>
-    </w:p>
-    <w:p>
-      <w:pPr>
-        <w:spacing w:line="276" w:lineRule="auto"/>
-        <w:jc w:val="center"/>
-        <w:rPr>
-          <w:rFonts w:asciiTheme="majorHAnsi" w:eastAsia="Montserrat" w:hAnsiTheme="majorHAnsi" w:cstheme="majorHAnsi"/>
-          <w:b/>
-          <w:bCs/>
-          <w:sz w:val="20"/>
-          <w:szCs w:val="20"/>
-        </w:rPr>
-      </w:pPr>
-      <w:r>
-        <w:rPr>
-          <w:rFonts w:asciiTheme="majorHAnsi" w:eastAsia="Montserrat" w:hAnsiTheme="majorHAnsi" w:cstheme="majorHAnsi"/>
-          <w:b/>
-          <w:bCs/>
-          <w:sz w:val="20"/>
-          <w:szCs w:val="20"/>
-        </w:rPr>
-        <w:t>{{ address }}</w:t>
-      </w:r>
-      <w:r>
-        <w:rPr>
-          <w:rFonts w:asciiTheme="majorHAnsi" w:eastAsia="Montserrat" w:hAnsiTheme="majorHAnsi" w:cstheme="majorHAnsi"/>
-          <w:b/>
-          <w:bCs/>
-          <w:sz w:val="20"/>
-          <w:szCs w:val="20"/>
-        </w:rPr>
-        <w:t xml:space="preserve"> |</w:t>
-      </w:r>
-      <w:r>
-        <w:rPr>
-          <w:rFonts w:asciiTheme="majorHAnsi" w:eastAsia="Montserrat" w:hAnsiTheme="majorHAnsi" w:cstheme="majorHAnsi"/>
-          <w:b/>
-          <w:bCs/>
-          <w:sz w:val="20"/>
-          <w:szCs w:val="20"/>
-        </w:rPr>
-        <w:t>{{ phone }}</w:t>
-      </w:r>
-      <w:r>
-        <w:rPr>
-          <w:rFonts w:asciiTheme="majorHAnsi" w:eastAsia="Montserrat" w:hAnsiTheme="majorHAnsi" w:cstheme="majorHAnsi"/>
-          <w:b/>
-          <w:bCs/>
-          <w:sz w:val="20"/>
-          <w:szCs w:val="20"/>
-        </w:rPr>
-        <w:t xml:space="preserve">| </w:t>
-      </w:r>
-      <w:r>
-        <w:rPr>
-          <w:rFonts w:asciiTheme="majorHAnsi" w:eastAsia="Montserrat" w:hAnsiTheme="majorHAnsi" w:cstheme="majorHAnsi"/>
-          <w:b/>
-          <w:bCs/>
-          <w:sz w:val="20"/>
-          <w:szCs w:val="20"/>
-        </w:rPr>
-        <w:t>{{ e</w:t>
-      </w:r>
-      <w:r>
-        <w:rPr>
-          <w:rFonts w:asciiTheme="majorHAnsi" w:eastAsia="Montserrat" w:hAnsiTheme="majorHAnsi" w:cstheme="majorHAnsi"/>
-          <w:b/>
-          <w:bCs/>
-          <w:sz w:val="20"/>
-          <w:szCs w:val="20"/>
-        </w:rPr>
-        <w:t>mail</w:t>
-      </w:r>
-      <w:r>
-        <w:rPr>
-          <w:rFonts w:asciiTheme="majorHAnsi" w:eastAsia="Montserrat" w:hAnsiTheme="majorHAnsi" w:cstheme="majorHAnsi"/>
-          <w:b/>
-          <w:bCs/>
-          <w:sz w:val="20"/>
-          <w:szCs w:val="20"/>
-        </w:rPr>
-        <w:t xml:space="preserve"> }}</w:t>
-      </w:r>
-      <w:r>
-        <w:rPr>
-          <w:rFonts w:asciiTheme="majorHAnsi" w:eastAsia="Montserrat" w:hAnsiTheme="majorHAnsi" w:cstheme="majorHAnsi"/>
-          <w:b/>
-          <w:bCs/>
-          <w:sz w:val="20"/>
-          <w:szCs w:val="20"/>
-        </w:rPr>
-        <w:t xml:space="preserve"> | </w:t>
-      </w:r>
-      <w:r>
-        <w:rPr>
-          <w:rFonts w:asciiTheme="majorHAnsi" w:eastAsia="Montserrat" w:hAnsiTheme="majorHAnsi" w:cstheme="majorHAnsi"/>
-          <w:b/>
-          <w:bCs/>
-          <w:sz w:val="20"/>
-          <w:szCs w:val="20"/>
-        </w:rPr>
-        <w:t>{{ l</w:t>
-      </w:r>
-      <w:r>
-        <w:rPr>
-          <w:rFonts w:asciiTheme="majorHAnsi" w:eastAsia="Montserrat" w:hAnsiTheme="majorHAnsi" w:cstheme="majorHAnsi"/>
-          <w:b/>
-          <w:bCs/>
-          <w:sz w:val="20"/>
-          <w:szCs w:val="20"/>
-        </w:rPr>
-        <w:t>inkedIn</w:t>
-      </w:r>
-      <w:r>
-        <w:rPr>
-          <w:rFonts w:asciiTheme="majorHAnsi" w:eastAsia="Montserrat" w:hAnsiTheme="majorHAnsi" w:cstheme="majorHAnsi"/>
-          <w:b/>
-          <w:bCs/>
-          <w:sz w:val="20"/>
-          <w:szCs w:val="20"/>
-        </w:rPr>
-        <w:t xml:space="preserve"> }}</w:t>
-      </w:r>
-    </w:p>
-    <w:p>
-      <w:pPr>
-        <w:spacing w:line="276" w:lineRule="auto"/>
-        <w:jc w:val="center"/>
         <w:rPr>
           <w:rFonts w:asciiTheme="majorHAnsi" w:eastAsia="Montserrat" w:hAnsiTheme="majorHAnsi" w:cstheme="majorHAnsi"/>
           <w:b/>
@@ -446,13 +327,59 @@
           <w:szCs w:val="18"/>
         </w:rPr>
       </w:pPr>
-      <w:r>
-        <w:rPr>
-          <w:rFonts w:asciiTheme="majorHAnsi" w:eastAsia="Montserrat" w:hAnsiTheme="majorHAnsi" w:cstheme="majorHAnsi"/>
-          <w:sz w:val="18"/>
-          <w:szCs w:val="18"/>
-        </w:rPr>
-        <w:t>{{ professional_summary }}</w:t>
+      <w:proofErr w:type="gramStart"/>
+      <w:r>
+        <w:rPr>
+          <w:rFonts w:asciiTheme="majorHAnsi" w:eastAsia="Montserrat" w:hAnsiTheme="majorHAnsi" w:cstheme="majorHAnsi"/>
+          <w:sz w:val="18"/>
+          <w:szCs w:val="18"/>
+        </w:rPr>
+        <w:t xml:space="preserve">{{ </w:t>
+      </w:r>
+      <w:proofErr w:type="spellStart"/>
+      <w:r>
+        <w:rPr>
+          <w:rFonts w:asciiTheme="majorHAnsi" w:eastAsia="Montserrat" w:hAnsiTheme="majorHAnsi" w:cstheme="majorHAnsi"/>
+          <w:sz w:val="18"/>
+          <w:szCs w:val="18"/>
+        </w:rPr>
+        <w:t>professional</w:t>
+      </w:r>
+      <w:proofErr w:type="gramEnd"/>
+      <w:r>
+        <w:rPr>
+          <w:rFonts w:asciiTheme="majorHAnsi" w:eastAsia="Montserrat" w:hAnsiTheme="majorHAnsi" w:cstheme="majorHAnsi"/>
+          <w:sz w:val="18"/>
+          <w:szCs w:val="18"/>
+        </w:rPr>
+        <w:t>_</w:t>
+      </w:r>
+      <w:proofErr w:type="gramStart"/>
+      <w:r>
+        <w:rPr>
+          <w:rFonts w:asciiTheme="majorHAnsi" w:eastAsia="Montserrat" w:hAnsiTheme="majorHAnsi" w:cstheme="majorHAnsi"/>
+          <w:sz w:val="18"/>
+          <w:szCs w:val="18"/>
+        </w:rPr>
+        <w:t>summary</w:t>
+      </w:r>
+      <w:proofErr w:type="spellEnd"/>
+      <w:r>
+        <w:rPr>
+          <w:rFonts w:asciiTheme="majorHAnsi" w:eastAsia="Montserrat" w:hAnsiTheme="majorHAnsi" w:cstheme="majorHAnsi"/>
+          <w:sz w:val="18"/>
+          <w:szCs w:val="18"/>
+        </w:rPr>
+        <w:t xml:space="preserve"> }</w:t>
+      </w:r>
+      <w:proofErr w:type="gramEnd"/>
+      <w:r>
+        <w:rPr>
+          <w:rFonts w:asciiTheme="majorHAnsi" w:eastAsia="Montserrat" w:hAnsiTheme="majorHAnsi" w:cstheme="majorHAnsi"/>
+          <w:sz w:val="18"/>
+          <w:szCs w:val="18"/>
+        </w:rPr>
+        <w:t>}</w:t>
       </w:r>
     </w:p>
     <w:p>
@@ -508,13 +435,23 @@
           <w:szCs w:val="18"/>
         </w:rPr>
       </w:pPr>
-      <w:r>
-        <w:rPr>
-          <w:rFonts w:asciiTheme="majorHAnsi" w:eastAsia="Montserrat" w:hAnsiTheme="majorHAnsi" w:cstheme="majorHAnsi"/>
-          <w:sz w:val="18"/>
-          <w:szCs w:val="18"/>
-        </w:rPr>
-        <w:t>{{ skills }}</w:t>
+      <w:proofErr w:type="gramStart"/>
+      <w:r>
+        <w:rPr>
+          <w:rFonts w:asciiTheme="majorHAnsi" w:eastAsia="Montserrat" w:hAnsiTheme="majorHAnsi" w:cstheme="majorHAnsi"/>
+          <w:sz w:val="18"/>
+          <w:szCs w:val="18"/>
+        </w:rPr>
+        <w:t>{{ skills</w:t>
+      </w:r>
+      <w:proofErr w:type="gramEnd"/>
+      <w:r>
+        <w:rPr>
+          <w:rFonts w:asciiTheme="majorHAnsi" w:eastAsia="Montserrat" w:hAnsiTheme="majorHAnsi" w:cstheme="majorHAnsi"/>
+          <w:sz w:val="18"/>
+          <w:szCs w:val="18"/>
+        </w:rPr>
+        <w:t xml:space="preserve"> }}</w:t>
       </w:r>
     </w:p>
     <w:p>
@@ -604,6 +541,7 @@
           <w:szCs w:val="18"/>
         </w:rPr>
       </w:pPr>
+      <w:proofErr w:type="gramStart"/>
       <w:r>
         <w:rPr>
           <w:rFonts w:asciiTheme="majorHAnsi" w:eastAsia="Montserrat" w:hAnsiTheme="majorHAnsi" w:cstheme="majorHAnsi"/>
@@ -611,7 +549,188 @@
           <w:sz w:val="18"/>
           <w:szCs w:val="18"/>
         </w:rPr>
-        <w:t>{{ ed.degree }}, {{ ed.institution }} ({{ ed.start }}–{{ ed.end }})</w:t>
+        <w:t xml:space="preserve">{{ </w:t>
+      </w:r>
+      <w:proofErr w:type="spellStart"/>
+      <w:r>
+        <w:rPr>
+          <w:rFonts w:asciiTheme="majorHAnsi" w:eastAsia="Montserrat" w:hAnsiTheme="majorHAnsi" w:cstheme="majorHAnsi"/>
+          <w:bCs/>
+          <w:sz w:val="18"/>
+          <w:szCs w:val="18"/>
+        </w:rPr>
+        <w:t>ed</w:t>
+      </w:r>
+      <w:proofErr w:type="gramEnd"/>
+      <w:r>
+        <w:rPr>
+          <w:rFonts w:asciiTheme="majorHAnsi" w:eastAsia="Montserrat" w:hAnsiTheme="majorHAnsi" w:cstheme="majorHAnsi"/>
+          <w:bCs/>
+          <w:sz w:val="18"/>
+          <w:szCs w:val="18"/>
+        </w:rPr>
+        <w:t>.</w:t>
+      </w:r>
+      <w:proofErr w:type="gramStart"/>
+      <w:r>
+        <w:rPr>
+          <w:rFonts w:asciiTheme="majorHAnsi" w:eastAsia="Montserrat" w:hAnsiTheme="majorHAnsi" w:cstheme="majorHAnsi"/>
+          <w:bCs/>
+          <w:sz w:val="18"/>
+          <w:szCs w:val="18"/>
+        </w:rPr>
+        <w:t>degree</w:t>
+      </w:r>
+      <w:proofErr w:type="spellEnd"/>
+      <w:r>
+        <w:rPr>
+          <w:rFonts w:asciiTheme="majorHAnsi" w:eastAsia="Montserrat" w:hAnsiTheme="majorHAnsi" w:cstheme="majorHAnsi"/>
+          <w:bCs/>
+          <w:sz w:val="18"/>
+          <w:szCs w:val="18"/>
+        </w:rPr>
+        <w:t xml:space="preserve"> }</w:t>
+      </w:r>
+      <w:proofErr w:type="gramEnd"/>
+      <w:r>
+        <w:rPr>
+          <w:rFonts w:asciiTheme="majorHAnsi" w:eastAsia="Montserrat" w:hAnsiTheme="majorHAnsi" w:cstheme="majorHAnsi"/>
+          <w:bCs/>
+          <w:sz w:val="18"/>
+          <w:szCs w:val="18"/>
+        </w:rPr>
+        <w:t xml:space="preserve">}, </w:t>
+      </w:r>
+      <w:proofErr w:type="gramStart"/>
+      <w:r>
+        <w:rPr>
+          <w:rFonts w:asciiTheme="majorHAnsi" w:eastAsia="Montserrat" w:hAnsiTheme="majorHAnsi" w:cstheme="majorHAnsi"/>
+          <w:bCs/>
+          <w:sz w:val="18"/>
+          <w:szCs w:val="18"/>
+        </w:rPr>
+        <w:t xml:space="preserve">{{ </w:t>
+      </w:r>
+      <w:proofErr w:type="spellStart"/>
+      <w:r>
+        <w:rPr>
+          <w:rFonts w:asciiTheme="majorHAnsi" w:eastAsia="Montserrat" w:hAnsiTheme="majorHAnsi" w:cstheme="majorHAnsi"/>
+          <w:bCs/>
+          <w:sz w:val="18"/>
+          <w:szCs w:val="18"/>
+        </w:rPr>
+        <w:t>ed</w:t>
+      </w:r>
+      <w:proofErr w:type="gramEnd"/>
+      <w:r>
+        <w:rPr>
+          <w:rFonts w:asciiTheme="majorHAnsi" w:eastAsia="Montserrat" w:hAnsiTheme="majorHAnsi" w:cstheme="majorHAnsi"/>
+          <w:bCs/>
+          <w:sz w:val="18"/>
+          <w:szCs w:val="18"/>
+        </w:rPr>
+        <w:t>.</w:t>
+      </w:r>
+      <w:proofErr w:type="gramStart"/>
+      <w:r>
+        <w:rPr>
+          <w:rFonts w:asciiTheme="majorHAnsi" w:eastAsia="Montserrat" w:hAnsiTheme="majorHAnsi" w:cstheme="majorHAnsi"/>
+          <w:bCs/>
+          <w:sz w:val="18"/>
+          <w:szCs w:val="18"/>
+        </w:rPr>
+        <w:t>institution</w:t>
+      </w:r>
+      <w:proofErr w:type="spellEnd"/>
+      <w:r>
+        <w:rPr>
+          <w:rFonts w:asciiTheme="majorHAnsi" w:eastAsia="Montserrat" w:hAnsiTheme="majorHAnsi" w:cstheme="majorHAnsi"/>
+          <w:bCs/>
+          <w:sz w:val="18"/>
+          <w:szCs w:val="18"/>
+        </w:rPr>
+        <w:t xml:space="preserve"> }</w:t>
+      </w:r>
+      <w:proofErr w:type="gramEnd"/>
+      <w:r>
+        <w:rPr>
+          <w:rFonts w:asciiTheme="majorHAnsi" w:eastAsia="Montserrat" w:hAnsiTheme="majorHAnsi" w:cstheme="majorHAnsi"/>
+          <w:bCs/>
+          <w:sz w:val="18"/>
+          <w:szCs w:val="18"/>
+        </w:rPr>
+        <w:t>} (</w:t>
+      </w:r>
+      <w:proofErr w:type="gramStart"/>
+      <w:r>
+        <w:rPr>
+          <w:rFonts w:asciiTheme="majorHAnsi" w:eastAsia="Montserrat" w:hAnsiTheme="majorHAnsi" w:cstheme="majorHAnsi"/>
+          <w:bCs/>
+          <w:sz w:val="18"/>
+          <w:szCs w:val="18"/>
+        </w:rPr>
+        <w:t xml:space="preserve">{{ </w:t>
+      </w:r>
+      <w:proofErr w:type="spellStart"/>
+      <w:r>
+        <w:rPr>
+          <w:rFonts w:asciiTheme="majorHAnsi" w:eastAsia="Montserrat" w:hAnsiTheme="majorHAnsi" w:cstheme="majorHAnsi"/>
+          <w:bCs/>
+          <w:sz w:val="18"/>
+          <w:szCs w:val="18"/>
+        </w:rPr>
+        <w:t>ed</w:t>
+      </w:r>
+      <w:proofErr w:type="gramEnd"/>
+      <w:r>
+        <w:rPr>
+          <w:rFonts w:asciiTheme="majorHAnsi" w:eastAsia="Montserrat" w:hAnsiTheme="majorHAnsi" w:cstheme="majorHAnsi"/>
+          <w:bCs/>
+          <w:sz w:val="18"/>
+          <w:szCs w:val="18"/>
+        </w:rPr>
+        <w:t>.</w:t>
+      </w:r>
+      <w:proofErr w:type="gramStart"/>
+      <w:r>
+        <w:rPr>
+          <w:rFonts w:asciiTheme="majorHAnsi" w:eastAsia="Montserrat" w:hAnsiTheme="majorHAnsi" w:cstheme="majorHAnsi"/>
+          <w:bCs/>
+          <w:sz w:val="18"/>
+          <w:szCs w:val="18"/>
+        </w:rPr>
+        <w:t>start</w:t>
+      </w:r>
+      <w:proofErr w:type="spellEnd"/>
+      <w:r>
+        <w:rPr>
+          <w:rFonts w:asciiTheme="majorHAnsi" w:eastAsia="Montserrat" w:hAnsiTheme="majorHAnsi" w:cstheme="majorHAnsi"/>
+          <w:bCs/>
+          <w:sz w:val="18"/>
+          <w:szCs w:val="18"/>
+        </w:rPr>
+        <w:t xml:space="preserve"> }}–{{ </w:t>
+      </w:r>
+      <w:proofErr w:type="spellStart"/>
+      <w:r>
+        <w:rPr>
+          <w:rFonts w:asciiTheme="majorHAnsi" w:eastAsia="Montserrat" w:hAnsiTheme="majorHAnsi" w:cstheme="majorHAnsi"/>
+          <w:bCs/>
+          <w:sz w:val="18"/>
+          <w:szCs w:val="18"/>
+        </w:rPr>
+        <w:t>ed.end</w:t>
+      </w:r>
+      <w:proofErr w:type="spellEnd"/>
+      <w:proofErr w:type="gramEnd"/>
+      <w:r>
+        <w:rPr>
+          <w:rFonts w:asciiTheme="majorHAnsi" w:eastAsia="Montserrat" w:hAnsiTheme="majorHAnsi" w:cstheme="majorHAnsi"/>
+          <w:bCs/>
+          <w:sz w:val="18"/>
+          <w:szCs w:val="18"/>
+        </w:rPr>
+        <w:t xml:space="preserve"> }})</w:t>
       </w:r>
     </w:p>
     <w:p>
@@ -636,7 +755,27 @@
           <w:sz w:val="18"/>
           <w:szCs w:val="18"/>
         </w:rPr>
-        <w:t>{% endfor %}</w:t>
+        <w:t xml:space="preserve">{% </w:t>
+      </w:r>
+      <w:proofErr w:type="spellStart"/>
+      <w:r>
+        <w:rPr>
+          <w:rFonts w:asciiTheme="majorHAnsi" w:eastAsia="Montserrat" w:hAnsiTheme="majorHAnsi" w:cstheme="majorHAnsi"/>
+          <w:bCs/>
+          <w:sz w:val="18"/>
+          <w:szCs w:val="18"/>
+        </w:rPr>
+        <w:t>endfor</w:t>
+      </w:r>
+      <w:proofErr w:type="spellEnd"/>
+      <w:r>
+        <w:rPr>
+          <w:rFonts w:asciiTheme="majorHAnsi" w:eastAsia="Montserrat" w:hAnsiTheme="majorHAnsi" w:cstheme="majorHAnsi"/>
+          <w:bCs/>
+          <w:sz w:val="18"/>
+          <w:szCs w:val="18"/>
+        </w:rPr>
+        <w:t xml:space="preserve"> %}</w:t>
       </w:r>
     </w:p>
     <w:p>
@@ -696,8 +835,36 @@
           <w:sz w:val="18"/>
           <w:szCs w:val="18"/>
         </w:rPr>
-        <w:t>{% for e in professional_experience %}</w:t>
-      </w:r>
+        <w:t xml:space="preserve">{% for e in </w:t>
+      </w:r>
+      <w:proofErr w:type="spellStart"/>
+      <w:r>
+        <w:rPr>
+          <w:rFonts w:asciiTheme="majorHAnsi" w:eastAsia="Montserrat" w:hAnsiTheme="majorHAnsi" w:cstheme="majorHAnsi"/>
+          <w:sz w:val="18"/>
+          <w:szCs w:val="18"/>
+        </w:rPr>
+        <w:t>professional_</w:t>
+      </w:r>
+      <w:proofErr w:type="gramStart"/>
+      <w:r>
+        <w:rPr>
+          <w:rFonts w:asciiTheme="majorHAnsi" w:eastAsia="Montserrat" w:hAnsiTheme="majorHAnsi" w:cstheme="majorHAnsi"/>
+          <w:sz w:val="18"/>
+          <w:szCs w:val="18"/>
+        </w:rPr>
+        <w:t>experience</w:t>
+      </w:r>
+      <w:proofErr w:type="spellEnd"/>
+      <w:r>
+        <w:rPr>
+          <w:rFonts w:asciiTheme="majorHAnsi" w:eastAsia="Montserrat" w:hAnsiTheme="majorHAnsi" w:cstheme="majorHAnsi"/>
+          <w:sz w:val="18"/>
+          <w:szCs w:val="18"/>
+        </w:rPr>
+        <w:t xml:space="preserve"> %}</w:t>
+      </w:r>
+      <w:proofErr w:type="gramEnd"/>
     </w:p>
     <w:p>
       <w:pPr>
@@ -707,13 +874,167 @@
           <w:szCs w:val="18"/>
         </w:rPr>
       </w:pPr>
-      <w:r>
-        <w:rPr>
-          <w:rFonts w:asciiTheme="majorHAnsi" w:eastAsia="Montserrat" w:hAnsiTheme="majorHAnsi" w:cstheme="majorHAnsi"/>
-          <w:sz w:val="18"/>
-          <w:szCs w:val="18"/>
-        </w:rPr>
-        <w:t>{{ e.company }}, {{ e.location }} ({{ e.dates }})</w:t>
+      <w:proofErr w:type="gramStart"/>
+      <w:r>
+        <w:rPr>
+          <w:rFonts w:asciiTheme="majorHAnsi" w:eastAsia="Montserrat" w:hAnsiTheme="majorHAnsi" w:cstheme="majorHAnsi"/>
+          <w:sz w:val="18"/>
+          <w:szCs w:val="18"/>
+        </w:rPr>
+        <w:t xml:space="preserve">{{ </w:t>
+      </w:r>
+      <w:proofErr w:type="spellStart"/>
+      <w:r>
+        <w:rPr>
+          <w:rFonts w:asciiTheme="majorHAnsi" w:eastAsia="Montserrat" w:hAnsiTheme="majorHAnsi" w:cstheme="majorHAnsi"/>
+          <w:sz w:val="18"/>
+          <w:szCs w:val="18"/>
+        </w:rPr>
+        <w:t>e</w:t>
+      </w:r>
+      <w:proofErr w:type="gramEnd"/>
+      <w:r>
+        <w:rPr>
+          <w:rFonts w:asciiTheme="majorHAnsi" w:eastAsia="Montserrat" w:hAnsiTheme="majorHAnsi" w:cstheme="majorHAnsi"/>
+          <w:sz w:val="18"/>
+          <w:szCs w:val="18"/>
+        </w:rPr>
+        <w:t>.</w:t>
+      </w:r>
+      <w:proofErr w:type="gramStart"/>
+      <w:r>
+        <w:rPr>
+          <w:rFonts w:asciiTheme="majorHAnsi" w:eastAsia="Montserrat" w:hAnsiTheme="majorHAnsi" w:cstheme="majorHAnsi"/>
+          <w:sz w:val="18"/>
+          <w:szCs w:val="18"/>
+        </w:rPr>
+        <w:t>company</w:t>
+      </w:r>
+      <w:proofErr w:type="spellEnd"/>
+      <w:r>
+        <w:rPr>
+          <w:rFonts w:asciiTheme="majorHAnsi" w:eastAsia="Montserrat" w:hAnsiTheme="majorHAnsi" w:cstheme="majorHAnsi"/>
+          <w:sz w:val="18"/>
+          <w:szCs w:val="18"/>
+        </w:rPr>
+        <w:t xml:space="preserve"> }</w:t>
+      </w:r>
+      <w:proofErr w:type="gramEnd"/>
+      <w:r>
+        <w:rPr>
+          <w:rFonts w:asciiTheme="majorHAnsi" w:eastAsia="Montserrat" w:hAnsiTheme="majorHAnsi" w:cstheme="majorHAnsi"/>
+          <w:sz w:val="18"/>
+          <w:szCs w:val="18"/>
+        </w:rPr>
+        <w:t xml:space="preserve">}, </w:t>
+      </w:r>
+      <w:proofErr w:type="gramStart"/>
+      <w:r>
+        <w:rPr>
+          <w:rFonts w:asciiTheme="majorHAnsi" w:eastAsia="Montserrat" w:hAnsiTheme="majorHAnsi" w:cstheme="majorHAnsi"/>
+          <w:sz w:val="18"/>
+          <w:szCs w:val="18"/>
+        </w:rPr>
+        <w:t xml:space="preserve">{{ </w:t>
+      </w:r>
+      <w:proofErr w:type="spellStart"/>
+      <w:r>
+        <w:rPr>
+          <w:rFonts w:asciiTheme="majorHAnsi" w:eastAsia="Montserrat" w:hAnsiTheme="majorHAnsi" w:cstheme="majorHAnsi"/>
+          <w:sz w:val="18"/>
+          <w:szCs w:val="18"/>
+        </w:rPr>
+        <w:t>e</w:t>
+      </w:r>
+      <w:proofErr w:type="gramEnd"/>
+      <w:r>
+        <w:rPr>
+          <w:rFonts w:asciiTheme="majorHAnsi" w:eastAsia="Montserrat" w:hAnsiTheme="majorHAnsi" w:cstheme="majorHAnsi"/>
+          <w:sz w:val="18"/>
+          <w:szCs w:val="18"/>
+        </w:rPr>
+        <w:t>.</w:t>
+      </w:r>
+      <w:proofErr w:type="gramStart"/>
+      <w:r>
+        <w:rPr>
+          <w:rFonts w:asciiTheme="majorHAnsi" w:eastAsia="Montserrat" w:hAnsiTheme="majorHAnsi" w:cstheme="majorHAnsi"/>
+          <w:sz w:val="18"/>
+          <w:szCs w:val="18"/>
+        </w:rPr>
+        <w:t>location</w:t>
+      </w:r>
+      <w:proofErr w:type="spellEnd"/>
+      <w:r>
+        <w:rPr>
+          <w:rFonts w:asciiTheme="majorHAnsi" w:eastAsia="Montserrat" w:hAnsiTheme="majorHAnsi" w:cstheme="majorHAnsi"/>
+          <w:sz w:val="18"/>
+          <w:szCs w:val="18"/>
+        </w:rPr>
+        <w:t xml:space="preserve"> }</w:t>
+      </w:r>
+      <w:proofErr w:type="gramEnd"/>
+      <w:r>
+        <w:rPr>
+          <w:rFonts w:asciiTheme="majorHAnsi" w:eastAsia="Montserrat" w:hAnsiTheme="majorHAnsi" w:cstheme="majorHAnsi"/>
+          <w:sz w:val="18"/>
+          <w:szCs w:val="18"/>
+        </w:rPr>
+        <w:t>} (</w:t>
+      </w:r>
+      <w:proofErr w:type="gramStart"/>
+      <w:r>
+        <w:rPr>
+          <w:rFonts w:asciiTheme="majorHAnsi" w:eastAsia="Montserrat" w:hAnsiTheme="majorHAnsi" w:cstheme="majorHAnsi"/>
+          <w:sz w:val="18"/>
+          <w:szCs w:val="18"/>
+        </w:rPr>
+        <w:t xml:space="preserve">{{ </w:t>
+      </w:r>
+      <w:proofErr w:type="spellStart"/>
+      <w:r>
+        <w:rPr>
+          <w:rFonts w:asciiTheme="majorHAnsi" w:eastAsia="Montserrat" w:hAnsiTheme="majorHAnsi" w:cstheme="majorHAnsi"/>
+          <w:sz w:val="18"/>
+          <w:szCs w:val="18"/>
+        </w:rPr>
+        <w:t>e</w:t>
+      </w:r>
+      <w:proofErr w:type="gramEnd"/>
+      <w:r>
+        <w:rPr>
+          <w:rFonts w:asciiTheme="majorHAnsi" w:eastAsia="Montserrat" w:hAnsiTheme="majorHAnsi" w:cstheme="majorHAnsi"/>
+          <w:sz w:val="18"/>
+          <w:szCs w:val="18"/>
+        </w:rPr>
+        <w:t>.</w:t>
+      </w:r>
+      <w:proofErr w:type="gramStart"/>
+      <w:r>
+        <w:rPr>
+          <w:rFonts w:asciiTheme="majorHAnsi" w:eastAsia="Montserrat" w:hAnsiTheme="majorHAnsi" w:cstheme="majorHAnsi"/>
+          <w:sz w:val="18"/>
+          <w:szCs w:val="18"/>
+        </w:rPr>
+        <w:t>dates</w:t>
+      </w:r>
+      <w:proofErr w:type="spellEnd"/>
+      <w:r>
+        <w:rPr>
+          <w:rFonts w:asciiTheme="majorHAnsi" w:eastAsia="Montserrat" w:hAnsiTheme="majorHAnsi" w:cstheme="majorHAnsi"/>
+          <w:sz w:val="18"/>
+          <w:szCs w:val="18"/>
+        </w:rPr>
+        <w:t xml:space="preserve"> }</w:t>
+      </w:r>
+      <w:proofErr w:type="gramEnd"/>
+      <w:r>
+        <w:rPr>
+          <w:rFonts w:asciiTheme="majorHAnsi" w:eastAsia="Montserrat" w:hAnsiTheme="majorHAnsi" w:cstheme="majorHAnsi"/>
+          <w:sz w:val="18"/>
+          <w:szCs w:val="18"/>
+        </w:rPr>
+        <w:t>})</w:t>
       </w:r>
     </w:p>
     <w:p>
@@ -730,7 +1051,61 @@
           <w:sz w:val="18"/>
           <w:szCs w:val="18"/>
         </w:rPr>
-        <w:t>Title: {{ e.title }}</w:t>
+        <w:t xml:space="preserve">Title: </w:t>
+      </w:r>
+      <w:proofErr w:type="gramStart"/>
+      <w:r>
+        <w:rPr>
+          <w:rFonts w:asciiTheme="majorHAnsi" w:eastAsia="Montserrat" w:hAnsiTheme="majorHAnsi" w:cstheme="majorHAnsi"/>
+          <w:sz w:val="18"/>
+          <w:szCs w:val="18"/>
+        </w:rPr>
+        <w:t xml:space="preserve">{{ </w:t>
+      </w:r>
+      <w:proofErr w:type="spellStart"/>
+      <w:r>
+        <w:rPr>
+          <w:rFonts w:asciiTheme="majorHAnsi" w:eastAsia="Montserrat" w:hAnsiTheme="majorHAnsi" w:cstheme="majorHAnsi"/>
+          <w:sz w:val="18"/>
+          <w:szCs w:val="18"/>
+        </w:rPr>
+        <w:t>e</w:t>
+      </w:r>
+      <w:proofErr w:type="gramEnd"/>
+      <w:r>
+        <w:rPr>
+          <w:rFonts w:asciiTheme="majorHAnsi" w:eastAsia="Montserrat" w:hAnsiTheme="majorHAnsi" w:cstheme="majorHAnsi"/>
+          <w:sz w:val="18"/>
+          <w:szCs w:val="18"/>
+        </w:rPr>
+        <w:t>.</w:t>
+      </w:r>
+      <w:proofErr w:type="gramStart"/>
+      <w:r>
+        <w:rPr>
+          <w:rFonts w:asciiTheme="majorHAnsi" w:eastAsia="Montserrat" w:hAnsiTheme="majorHAnsi" w:cstheme="majorHAnsi"/>
+          <w:sz w:val="18"/>
+          <w:szCs w:val="18"/>
+        </w:rPr>
+        <w:t>title</w:t>
+      </w:r>
+      <w:proofErr w:type="spellEnd"/>
+      <w:r>
+        <w:rPr>
+          <w:rFonts w:asciiTheme="majorHAnsi" w:eastAsia="Montserrat" w:hAnsiTheme="majorHAnsi" w:cstheme="majorHAnsi"/>
+          <w:sz w:val="18"/>
+          <w:szCs w:val="18"/>
+        </w:rPr>
+        <w:t xml:space="preserve"> }</w:t>
+      </w:r>
+      <w:proofErr w:type="gramEnd"/>
+      <w:r>
+        <w:rPr>
+          <w:rFonts w:asciiTheme="majorHAnsi" w:eastAsia="Montserrat" w:hAnsiTheme="majorHAnsi" w:cstheme="majorHAnsi"/>
+          <w:sz w:val="18"/>
+          <w:szCs w:val="18"/>
+        </w:rPr>
+        <w:t>}</w:t>
       </w:r>
     </w:p>
     <w:p>
@@ -741,13 +1116,59 @@
           <w:szCs w:val="18"/>
         </w:rPr>
       </w:pPr>
-      <w:r>
-        <w:rPr>
-          <w:rFonts w:asciiTheme="majorHAnsi" w:eastAsia="Montserrat" w:hAnsiTheme="majorHAnsi" w:cstheme="majorHAnsi"/>
-          <w:sz w:val="18"/>
-          <w:szCs w:val="18"/>
-        </w:rPr>
-        <w:t>{{ e.details }}</w:t>
+      <w:proofErr w:type="gramStart"/>
+      <w:r>
+        <w:rPr>
+          <w:rFonts w:asciiTheme="majorHAnsi" w:eastAsia="Montserrat" w:hAnsiTheme="majorHAnsi" w:cstheme="majorHAnsi"/>
+          <w:sz w:val="18"/>
+          <w:szCs w:val="18"/>
+        </w:rPr>
+        <w:t xml:space="preserve">{{ </w:t>
+      </w:r>
+      <w:proofErr w:type="spellStart"/>
+      <w:r>
+        <w:rPr>
+          <w:rFonts w:asciiTheme="majorHAnsi" w:eastAsia="Montserrat" w:hAnsiTheme="majorHAnsi" w:cstheme="majorHAnsi"/>
+          <w:sz w:val="18"/>
+          <w:szCs w:val="18"/>
+        </w:rPr>
+        <w:t>e</w:t>
+      </w:r>
+      <w:proofErr w:type="gramEnd"/>
+      <w:r>
+        <w:rPr>
+          <w:rFonts w:asciiTheme="majorHAnsi" w:eastAsia="Montserrat" w:hAnsiTheme="majorHAnsi" w:cstheme="majorHAnsi"/>
+          <w:sz w:val="18"/>
+          <w:szCs w:val="18"/>
+        </w:rPr>
+        <w:t>.</w:t>
+      </w:r>
+      <w:proofErr w:type="gramStart"/>
+      <w:r>
+        <w:rPr>
+          <w:rFonts w:asciiTheme="majorHAnsi" w:eastAsia="Montserrat" w:hAnsiTheme="majorHAnsi" w:cstheme="majorHAnsi"/>
+          <w:sz w:val="18"/>
+          <w:szCs w:val="18"/>
+        </w:rPr>
+        <w:t>details</w:t>
+      </w:r>
+      <w:proofErr w:type="spellEnd"/>
+      <w:r>
+        <w:rPr>
+          <w:rFonts w:asciiTheme="majorHAnsi" w:eastAsia="Montserrat" w:hAnsiTheme="majorHAnsi" w:cstheme="majorHAnsi"/>
+          <w:sz w:val="18"/>
+          <w:szCs w:val="18"/>
+        </w:rPr>
+        <w:t xml:space="preserve"> }</w:t>
+      </w:r>
+      <w:proofErr w:type="gramEnd"/>
+      <w:r>
+        <w:rPr>
+          <w:rFonts w:asciiTheme="majorHAnsi" w:eastAsia="Montserrat" w:hAnsiTheme="majorHAnsi" w:cstheme="majorHAnsi"/>
+          <w:sz w:val="18"/>
+          <w:szCs w:val="18"/>
+        </w:rPr>
+        <w:t>}</w:t>
       </w:r>
     </w:p>
     <w:p>
@@ -764,7 +1185,25 @@
           <w:sz w:val="18"/>
           <w:szCs w:val="18"/>
         </w:rPr>
-        <w:t>{% endfor %}</w:t>
+        <w:t xml:space="preserve">{% </w:t>
+      </w:r>
+      <w:proofErr w:type="spellStart"/>
+      <w:r>
+        <w:rPr>
+          <w:rFonts w:asciiTheme="majorHAnsi" w:eastAsia="Montserrat" w:hAnsiTheme="majorHAnsi" w:cstheme="majorHAnsi"/>
+          <w:sz w:val="18"/>
+          <w:szCs w:val="18"/>
+        </w:rPr>
+        <w:t>endfor</w:t>
+      </w:r>
+      <w:proofErr w:type="spellEnd"/>
+      <w:r>
+        <w:rPr>
+          <w:rFonts w:asciiTheme="majorHAnsi" w:eastAsia="Montserrat" w:hAnsiTheme="majorHAnsi" w:cstheme="majorHAnsi"/>
+          <w:sz w:val="18"/>
+          <w:szCs w:val="18"/>
+        </w:rPr>
+        <w:t xml:space="preserve"> %}</w:t>
       </w:r>
     </w:p>
     <w:p>
@@ -824,8 +1263,9 @@
           <w:sz w:val="18"/>
           <w:szCs w:val="18"/>
         </w:rPr>
-        <w:t>{% for c in certification</w:t>
-      </w:r>
+        <w:t xml:space="preserve">{% for c in </w:t>
+      </w:r>
+      <w:proofErr w:type="spellStart"/>
       <w:r>
         <w:rPr>
           <w:rFonts w:asciiTheme="majorHAnsi" w:eastAsia="Montserrat" w:hAnsiTheme="majorHAnsi" w:cstheme="majorHAnsi"/>
@@ -833,7 +1273,7 @@
           <w:sz w:val="18"/>
           <w:szCs w:val="18"/>
         </w:rPr>
-        <w:t>_specialized_training</w:t>
+        <w:t>certification</w:t>
       </w:r>
       <w:r>
         <w:rPr>
@@ -842,8 +1282,29 @@
           <w:sz w:val="18"/>
           <w:szCs w:val="18"/>
         </w:rPr>
+        <w:t>_specialized_</w:t>
+      </w:r>
+      <w:proofErr w:type="gramStart"/>
+      <w:r>
+        <w:rPr>
+          <w:rFonts w:asciiTheme="majorHAnsi" w:eastAsia="Montserrat" w:hAnsiTheme="majorHAnsi" w:cstheme="majorHAnsi"/>
+          <w:bCs/>
+          <w:sz w:val="18"/>
+          <w:szCs w:val="18"/>
+        </w:rPr>
+        <w:t>training</w:t>
+      </w:r>
+      <w:proofErr w:type="spellEnd"/>
+      <w:r>
+        <w:rPr>
+          <w:rFonts w:asciiTheme="majorHAnsi" w:eastAsia="Montserrat" w:hAnsiTheme="majorHAnsi" w:cstheme="majorHAnsi"/>
+          <w:bCs/>
+          <w:sz w:val="18"/>
+          <w:szCs w:val="18"/>
+        </w:rPr>
         <w:t xml:space="preserve"> %}</w:t>
       </w:r>
+      <w:proofErr w:type="gramEnd"/>
     </w:p>
     <w:p>
       <w:pPr>
@@ -863,8 +1324,9 @@
           <w:sz w:val="18"/>
           <w:szCs w:val="18"/>
         </w:rPr>
-        <w:t>• {{ c</w:t>
-      </w:r>
+        <w:t xml:space="preserve">• </w:t>
+      </w:r>
+      <w:proofErr w:type="gramStart"/>
       <w:r>
         <w:rPr>
           <w:rFonts w:asciiTheme="majorHAnsi" w:eastAsia="Montserrat" w:hAnsiTheme="majorHAnsi" w:cstheme="majorHAnsi"/>
@@ -872,8 +1334,9 @@
           <w:sz w:val="18"/>
           <w:szCs w:val="18"/>
         </w:rPr>
-        <w:t>.name</w:t>
-      </w:r>
+        <w:t>{{ c</w:t>
+      </w:r>
+      <w:proofErr w:type="gramEnd"/>
       <w:r>
         <w:rPr>
           <w:rFonts w:asciiTheme="majorHAnsi" w:eastAsia="Montserrat" w:hAnsiTheme="majorHAnsi" w:cstheme="majorHAnsi"/>
@@ -881,8 +1344,9 @@
           <w:sz w:val="18"/>
           <w:szCs w:val="18"/>
         </w:rPr>
-        <w:t xml:space="preserve"> }}</w:t>
-      </w:r>
+        <w:t>.</w:t>
+      </w:r>
+      <w:proofErr w:type="gramStart"/>
       <w:r>
         <w:rPr>
           <w:rFonts w:asciiTheme="majorHAnsi" w:eastAsia="Montserrat" w:hAnsiTheme="majorHAnsi" w:cstheme="majorHAnsi"/>
@@ -890,7 +1354,57 @@
           <w:sz w:val="18"/>
           <w:szCs w:val="18"/>
         </w:rPr>
-        <w:t xml:space="preserve"> ({{c.date}})</w:t>
+        <w:t>name</w:t>
+      </w:r>
+      <w:r>
+        <w:rPr>
+          <w:rFonts w:asciiTheme="majorHAnsi" w:eastAsia="Montserrat" w:hAnsiTheme="majorHAnsi" w:cstheme="majorHAnsi"/>
+          <w:bCs/>
+          <w:sz w:val="18"/>
+          <w:szCs w:val="18"/>
+        </w:rPr>
+        <w:t xml:space="preserve"> }</w:t>
+      </w:r>
+      <w:proofErr w:type="gramEnd"/>
+      <w:r>
+        <w:rPr>
+          <w:rFonts w:asciiTheme="majorHAnsi" w:eastAsia="Montserrat" w:hAnsiTheme="majorHAnsi" w:cstheme="majorHAnsi"/>
+          <w:bCs/>
+          <w:sz w:val="18"/>
+          <w:szCs w:val="18"/>
+        </w:rPr>
+        <w:t>}</w:t>
+      </w:r>
+      <w:r>
+        <w:rPr>
+          <w:rFonts w:asciiTheme="majorHAnsi" w:eastAsia="Montserrat" w:hAnsiTheme="majorHAnsi" w:cstheme="majorHAnsi"/>
+          <w:bCs/>
+          <w:sz w:val="18"/>
+          <w:szCs w:val="18"/>
+        </w:rPr>
+        <w:t xml:space="preserve"> ({{</w:t>
+      </w:r>
+      <w:proofErr w:type="spellStart"/>
+      <w:proofErr w:type="gramStart"/>
+      <w:r>
+        <w:rPr>
+          <w:rFonts w:asciiTheme="majorHAnsi" w:eastAsia="Montserrat" w:hAnsiTheme="majorHAnsi" w:cstheme="majorHAnsi"/>
+          <w:bCs/>
+          <w:sz w:val="18"/>
+          <w:szCs w:val="18"/>
+        </w:rPr>
+        <w:t>c.date</w:t>
+      </w:r>
+      <w:proofErr w:type="spellEnd"/>
+      <w:proofErr w:type="gramEnd"/>
+      <w:r>
+        <w:rPr>
+          <w:rFonts w:asciiTheme="majorHAnsi" w:eastAsia="Montserrat" w:hAnsiTheme="majorHAnsi" w:cstheme="majorHAnsi"/>
+          <w:bCs/>
+          <w:sz w:val="18"/>
+          <w:szCs w:val="18"/>
+        </w:rPr>
+        <w:t>}})</w:t>
       </w:r>
     </w:p>
     <w:p>
@@ -911,7 +1425,27 @@
           <w:sz w:val="18"/>
           <w:szCs w:val="18"/>
         </w:rPr>
-        <w:t>{% endfor %}</w:t>
+        <w:t xml:space="preserve">{% </w:t>
+      </w:r>
+      <w:proofErr w:type="spellStart"/>
+      <w:r>
+        <w:rPr>
+          <w:rFonts w:asciiTheme="majorHAnsi" w:eastAsia="Montserrat" w:hAnsiTheme="majorHAnsi" w:cstheme="majorHAnsi"/>
+          <w:bCs/>
+          <w:sz w:val="18"/>
+          <w:szCs w:val="18"/>
+        </w:rPr>
+        <w:t>endfor</w:t>
+      </w:r>
+      <w:proofErr w:type="spellEnd"/>
+      <w:r>
+        <w:rPr>
+          <w:rFonts w:asciiTheme="majorHAnsi" w:eastAsia="Montserrat" w:hAnsiTheme="majorHAnsi" w:cstheme="majorHAnsi"/>
+          <w:bCs/>
+          <w:sz w:val="18"/>
+          <w:szCs w:val="18"/>
+        </w:rPr>
+        <w:t xml:space="preserve"> %}</w:t>
       </w:r>
     </w:p>
     <w:p>
@@ -969,8 +1503,18 @@
           <w:sz w:val="18"/>
           <w:szCs w:val="18"/>
         </w:rPr>
-        <w:t>{% for lang in languages %}</w:t>
-      </w:r>
+        <w:t xml:space="preserve">{% for lang in </w:t>
+      </w:r>
+      <w:proofErr w:type="gramStart"/>
+      <w:r>
+        <w:rPr>
+          <w:rFonts w:asciiTheme="majorHAnsi" w:eastAsia="Montserrat" w:hAnsiTheme="majorHAnsi" w:cstheme="majorHAnsi"/>
+          <w:sz w:val="18"/>
+          <w:szCs w:val="18"/>
+        </w:rPr>
+        <w:t>languages %}</w:t>
+      </w:r>
+      <w:proofErr w:type="gramEnd"/>
     </w:p>
     <w:p>
       <w:pPr>
@@ -992,7 +1536,25 @@
           <w:sz w:val="18"/>
           <w:szCs w:val="18"/>
         </w:rPr>
-        <w:t>• {{ lang }}</w:t>
+        <w:t xml:space="preserve">• </w:t>
+      </w:r>
+      <w:proofErr w:type="gramStart"/>
+      <w:r>
+        <w:rPr>
+          <w:rFonts w:asciiTheme="majorHAnsi" w:eastAsia="Montserrat" w:hAnsiTheme="majorHAnsi" w:cstheme="majorHAnsi"/>
+          <w:sz w:val="18"/>
+          <w:szCs w:val="18"/>
+        </w:rPr>
+        <w:t>{{ lang</w:t>
+      </w:r>
+      <w:proofErr w:type="gramEnd"/>
+      <w:r>
+        <w:rPr>
+          <w:rFonts w:asciiTheme="majorHAnsi" w:eastAsia="Montserrat" w:hAnsiTheme="majorHAnsi" w:cstheme="majorHAnsi"/>
+          <w:sz w:val="18"/>
+          <w:szCs w:val="18"/>
+        </w:rPr>
+        <w:t xml:space="preserve"> }}</w:t>
       </w:r>
     </w:p>
     <w:p>
@@ -1015,7 +1577,25 @@
           <w:sz w:val="18"/>
           <w:szCs w:val="18"/>
         </w:rPr>
-        <w:t>{% endfor %}</w:t>
+        <w:t xml:space="preserve">{% </w:t>
+      </w:r>
+      <w:proofErr w:type="spellStart"/>
+      <w:r>
+        <w:rPr>
+          <w:rFonts w:asciiTheme="majorHAnsi" w:eastAsia="Montserrat" w:hAnsiTheme="majorHAnsi" w:cstheme="majorHAnsi"/>
+          <w:sz w:val="18"/>
+          <w:szCs w:val="18"/>
+        </w:rPr>
+        <w:t>endfor</w:t>
+      </w:r>
+      <w:proofErr w:type="spellEnd"/>
+      <w:r>
+        <w:rPr>
+          <w:rFonts w:asciiTheme="majorHAnsi" w:eastAsia="Montserrat" w:hAnsiTheme="majorHAnsi" w:cstheme="majorHAnsi"/>
+          <w:sz w:val="18"/>
+          <w:szCs w:val="18"/>
+        </w:rPr>
+        <w:t xml:space="preserve"> %}</w:t>
       </w:r>
     </w:p>
     <w:p>

</xml_diff>